<commit_message>
Sync resume source, LaTeX, and DOCX after manual tex edits
Updated md to match tex: summary wording, location format, ICASA (NMT)
naming, contractor descriptions, reference title, NL-to-SQL project
bullets. Regenerated DOCX from synced source.

Co-Authored-By: Claude Opus 4.6 (1M context) <noreply@anthropic.com>
</commit_message>
<xml_diff>
--- a/resume/jennifer.docx
+++ b/resume/jennifer.docx
@@ -27,7 +27,7 @@
           <w:color w:val="555555"/>
           <w:sz w:val="18"/>
         </w:rPr>
-        <w:t>Miami, Florida  |  Remote, EST  |  quay@quay-cncpts.com  |  linkedin.com/in/jennifer-quay-minnich  |  347-844-1684 (text)</w:t>
+        <w:t>Miami, Florida (Remote, EST)  |  quay@quay-cncpts.com  |  linkedin.com/in/jennifer-quay-minnich  |  347-844-1684 (text)</w:t>
       </w:r>
     </w:p>
     <w:p>
@@ -38,7 +38,7 @@
           <w:color w:val="000000"/>
           <w:sz w:val="19"/>
         </w:rPr>
-        <w:t>ML/AI Engineer | ICML 2026 co-author | 9+ years shipping production software | 4+ years LLM Laboratory Directed Research + Development | 4+ years building AI systems and governance infrastructure for DHS, HHS, and DOE | Public Trust Clearance</w:t>
+        <w:t>ML/AI Engineer | ICML 2026 co-author | 9+ years shipping production software | 4+ years LLM and ML Laboratory Directed Research + Development | 3+ years building AI systems and governance infrastructure for US federal government</w:t>
       </w:r>
     </w:p>
     <w:p>
@@ -354,7 +354,7 @@
           <w:color w:val="555555"/>
           <w:sz w:val="18"/>
         </w:rPr>
-        <w:t>Baltimore, MD (Remote) | Federal contractor | Public Trust Clearance</w:t>
+        <w:t>Baltimore, MD (Remote) | Federal contractor</w:t>
       </w:r>
     </w:p>
     <w:p>
@@ -450,7 +450,7 @@
           <w:color w:val="000000"/>
           <w:sz w:val="19"/>
         </w:rPr>
-        <w:t>Automated DHS-FEMA operational reporting and ACF-OHS helpdesk ticket routing, reducing hours of manual lift by half for furloughed personnel.</w:t>
+        <w:t>Automated DHS-FEMA operational reporting and ACF-OHS helpdesk ticket routing, reducing hours of manual lift for personnel.</w:t>
       </w:r>
     </w:p>
     <w:p>
@@ -466,7 +466,7 @@
           <w:color w:val="000000"/>
           <w:sz w:val="20"/>
         </w:rPr>
-        <w:t>Machine Learning Engineer  |  ICASA</w:t>
+        <w:t>Machine Learning Engineer  |  ICASA (NMT)</w:t>
       </w:r>
       <w:r>
         <w:rPr>
@@ -487,7 +487,7 @@
           <w:color w:val="555555"/>
           <w:sz w:val="18"/>
         </w:rPr>
-        <w:t>Socorro, NM (Remote) | Federal contractor for DOE, State Contractor for NM State Higher Education, NM Legislative Committee</w:t>
+        <w:t>Socorro, NM (Remote) | Federal contractor for DOE | Government Contractor for the State of New Mexico</w:t>
       </w:r>
     </w:p>
     <w:p>
@@ -583,7 +583,7 @@
           <w:color w:val="000000"/>
           <w:sz w:val="20"/>
         </w:rPr>
-        <w:t>Data Scientist (Intern to Hire)  |  ICASA / NM Tech Office of Institutional Research</w:t>
+        <w:t>Data Scientist  |  ICASA (NMT)</w:t>
       </w:r>
       <w:r>
         <w:rPr>
@@ -604,7 +604,7 @@
           <w:color w:val="555555"/>
           <w:sz w:val="18"/>
         </w:rPr>
-        <w:t>Socorro, NM (Remote) | NM State Higher Education contract</w:t>
+        <w:t>Socorro, NM (Remote) | Government Contractor for the State of New Mexico</w:t>
       </w:r>
     </w:p>
     <w:p>
@@ -689,7 +689,7 @@
           <w:color w:val="555555"/>
           <w:sz w:val="18"/>
         </w:rPr>
-        <w:t>Philadelphia, PA (Remote) | International e-commerce and consumer technology consultant</w:t>
+        <w:t>Philadelphia, PA (Remote) | International consumer technology consultant</w:t>
       </w:r>
     </w:p>
     <w:p>
@@ -1566,6 +1566,65 @@
         <w:rPr>
           <w:rFonts w:ascii="Calibri" w:hAnsi="Calibri"/>
           <w:b/>
+          <w:color w:val="000000"/>
+          <w:sz w:val="20"/>
+        </w:rPr>
+        <w:t>2023  |  Natural Language Interface for NM Tax Data</w:t>
+      </w:r>
+    </w:p>
+    <w:p>
+      <w:pPr>
+        <w:pStyle w:val="ListBullet"/>
+        <w:spacing w:before="20" w:after="20"/>
+        <w:ind w:left="360"/>
+      </w:pPr>
+      <w:r>
+        <w:rPr>
+          <w:rFonts w:ascii="Calibri" w:hAnsi="Calibri"/>
+          <w:b w:val="0"/>
+          <w:color w:val="000000"/>
+          <w:sz w:val="19"/>
+        </w:rPr>
+        <w:t>Fine-tuned Meta AI Llama 2 using HuggingFace and PyTorch, achieving 92.5% accuracy for NL-to-SQL generation.</w:t>
+      </w:r>
+    </w:p>
+    <w:p>
+      <w:pPr>
+        <w:pStyle w:val="ListBullet"/>
+        <w:spacing w:before="20" w:after="20"/>
+        <w:ind w:left="360"/>
+      </w:pPr>
+      <w:r>
+        <w:rPr>
+          <w:rFonts w:ascii="Calibri" w:hAnsi="Calibri"/>
+          <w:b w:val="0"/>
+          <w:color w:val="000000"/>
+          <w:sz w:val="19"/>
+        </w:rPr>
+        <w:t>Implemented LlamaIndex and LangChain for optimized RAG.</w:t>
+      </w:r>
+    </w:p>
+    <w:p>
+      <w:pPr>
+        <w:pStyle w:val="ListBullet"/>
+        <w:spacing w:before="20" w:after="20"/>
+        <w:ind w:left="360"/>
+      </w:pPr>
+      <w:r>
+        <w:rPr>
+          <w:rFonts w:ascii="Calibri" w:hAnsi="Calibri"/>
+          <w:b w:val="0"/>
+          <w:color w:val="000000"/>
+          <w:sz w:val="19"/>
+        </w:rPr>
+        <w:t>Deployed on GCP Vertex AI with MongoDB document store.</w:t>
+      </w:r>
+    </w:p>
+    <w:p>
+      <w:r>
+        <w:rPr>
+          <w:rFonts w:ascii="Calibri" w:hAnsi="Calibri"/>
+          <w:b/>
           <w:color w:val="D06B00"/>
           <w:sz w:val="20"/>
         </w:rPr>
@@ -1691,65 +1750,6 @@
       </w:r>
     </w:p>
     <w:p>
-      <w:r>
-        <w:rPr>
-          <w:rFonts w:ascii="Calibri" w:hAnsi="Calibri"/>
-          <w:b/>
-          <w:color w:val="000000"/>
-          <w:sz w:val="20"/>
-        </w:rPr>
-        <w:t>2023  |  Natural Language Interface for NM Tax Data</w:t>
-      </w:r>
-    </w:p>
-    <w:p>
-      <w:pPr>
-        <w:pStyle w:val="ListBullet"/>
-        <w:spacing w:before="20" w:after="20"/>
-        <w:ind w:left="360"/>
-      </w:pPr>
-      <w:r>
-        <w:rPr>
-          <w:rFonts w:ascii="Calibri" w:hAnsi="Calibri"/>
-          <w:b w:val="0"/>
-          <w:color w:val="000000"/>
-          <w:sz w:val="19"/>
-        </w:rPr>
-        <w:t>Fine-tuned Meta AI Llama 2 using HuggingFace and PyTorch, achieving 92.5% accuracy for NL-to-SQL generation.</w:t>
-      </w:r>
-    </w:p>
-    <w:p>
-      <w:pPr>
-        <w:pStyle w:val="ListBullet"/>
-        <w:spacing w:before="20" w:after="20"/>
-        <w:ind w:left="360"/>
-      </w:pPr>
-      <w:r>
-        <w:rPr>
-          <w:rFonts w:ascii="Calibri" w:hAnsi="Calibri"/>
-          <w:b w:val="0"/>
-          <w:color w:val="000000"/>
-          <w:sz w:val="19"/>
-        </w:rPr>
-        <w:t>Implemented LlamaIndex and LangChain for optimized RAG.</w:t>
-      </w:r>
-    </w:p>
-    <w:p>
-      <w:pPr>
-        <w:pStyle w:val="ListBullet"/>
-        <w:spacing w:before="20" w:after="20"/>
-        <w:ind w:left="360"/>
-      </w:pPr>
-      <w:r>
-        <w:rPr>
-          <w:rFonts w:ascii="Calibri" w:hAnsi="Calibri"/>
-          <w:b w:val="0"/>
-          <w:color w:val="000000"/>
-          <w:sz w:val="19"/>
-        </w:rPr>
-        <w:t>Deployed on GCP Vertex AI with MongoDB document store.</w:t>
-      </w:r>
-    </w:p>
-    <w:p>
       <w:pPr>
         <w:pBdr>
           <w:bottom w:val="single" w:sz="4" w:space="1" w:color="D06B00"/>
@@ -1763,6 +1763,37 @@
           <w:sz w:val="22"/>
         </w:rPr>
         <w:t>REFERENCES</w:t>
+      </w:r>
+    </w:p>
+    <w:p>
+      <w:r>
+        <w:rPr>
+          <w:rFonts w:ascii="Calibri" w:hAnsi="Calibri"/>
+          <w:b/>
+          <w:color w:val="000000"/>
+          <w:sz w:val="20"/>
+        </w:rPr>
+        <w:t>Justin Hoffman</w:t>
+      </w:r>
+      <w:r>
+        <w:rPr>
+          <w:rFonts w:ascii="Calibri" w:hAnsi="Calibri"/>
+          <w:b w:val="0"/>
+          <w:color w:val="000000"/>
+          <w:sz w:val="19"/>
+        </w:rPr>
+        <w:t xml:space="preserve">  |  Director of AI Software Engineering  |  Arch Systems Inc., Federal Contractor</w:t>
+      </w:r>
+    </w:p>
+    <w:p>
+      <w:r>
+        <w:rPr>
+          <w:rFonts w:ascii="Calibri" w:hAnsi="Calibri"/>
+          <w:b w:val="0"/>
+          <w:color w:val="555555"/>
+          <w:sz w:val="18"/>
+        </w:rPr>
+        <w:t>jhoffman@archsystemsinc.com  |  (210) 875-8278</w:t>
       </w:r>
     </w:p>
     <w:p>
@@ -1794,37 +1825,6 @@
           <w:sz w:val="18"/>
         </w:rPr>
         <w:t>jane.yang@acf.hhs.gov  |  (202) 545-4952</w:t>
-      </w:r>
-    </w:p>
-    <w:p>
-      <w:r>
-        <w:rPr>
-          <w:rFonts w:ascii="Calibri" w:hAnsi="Calibri"/>
-          <w:b/>
-          <w:color w:val="000000"/>
-          <w:sz w:val="20"/>
-        </w:rPr>
-        <w:t>Justin Hoffman</w:t>
-      </w:r>
-      <w:r>
-        <w:rPr>
-          <w:rFonts w:ascii="Calibri" w:hAnsi="Calibri"/>
-          <w:b w:val="0"/>
-          <w:color w:val="000000"/>
-          <w:sz w:val="19"/>
-        </w:rPr>
-        <w:t xml:space="preserve">  |  Principal AI Data Scientist  |  Arch Systems</w:t>
-      </w:r>
-    </w:p>
-    <w:p>
-      <w:r>
-        <w:rPr>
-          <w:rFonts w:ascii="Calibri" w:hAnsi="Calibri"/>
-          <w:b w:val="0"/>
-          <w:color w:val="555555"/>
-          <w:sz w:val="18"/>
-        </w:rPr>
-        <w:t>jhoffman@archsystemsinc.com  |  (210) 875-8278</w:t>
       </w:r>
     </w:p>
     <w:p>

</xml_diff>